<commit_message>
Add full 2-page A4 demo with legal contract documents
Doc A: casual service agreement (PT Maju Bersama ↔ Mr. Budi Santoso)
Doc B: formal benchmark of the same contract

Pipeline results:
- 2 pages processed, 51 sentences reviewed
- 22 sentences revised, 29 unchanged
- 21 tracked deletions + 21 insertions + 2 comments in output DOCX
- Native w:del/w:ins tracked changes, Word opens in review mode

https://claude.ai/code/session_01T4qVPqrrPrq3awLbnXUfob
</commit_message>
<xml_diff>
--- a/doc_a.docx
+++ b/doc_a.docx
@@ -3,18 +3,301 @@
 <w:document xmlns:wpc="http://schemas.microsoft.com/office/word/2010/wordprocessingCanvas" xmlns:mo="http://schemas.microsoft.com/office/mac/office/2008/main" xmlns:mc="http://schemas.openxmlformats.org/markup-compatibility/2006" xmlns:mv="urn:schemas-microsoft-com:mac:vml" xmlns:o="urn:schemas-microsoft-com:office:office" xmlns:r="http://schemas.openxmlformats.org/officeDocument/2006/relationships" xmlns:m="http://schemas.openxmlformats.org/officeDocument/2006/math" xmlns:v="urn:schemas-microsoft-com:vml" xmlns:wp14="http://schemas.microsoft.com/office/word/2010/wordprocessingDrawing" xmlns:wp="http://schemas.openxmlformats.org/drawingml/2006/wordprocessingDrawing" xmlns:w10="urn:schemas-microsoft-com:office:word" xmlns:w="http://schemas.openxmlformats.org/wordprocessingml/2006/main" xmlns:w14="http://schemas.microsoft.com/office/word/2010/wordml" xmlns:wpg="http://schemas.microsoft.com/office/word/2010/wordprocessingGroup" xmlns:wpi="http://schemas.microsoft.com/office/word/2010/wordprocessingInk" xmlns:wne="http://schemas.microsoft.com/office/word/2006/wordml" xmlns:wps="http://schemas.microsoft.com/office/word/2010/wordprocessingShape" mc:Ignorable="w14 wp14">
   <w:body>
     <w:p>
+      <w:pPr>
+        <w:spacing w:after="240"/>
+      </w:pPr>
       <w:r>
-        <w:t>If the Buyer doesn't pay within 30 days, the Seller can basically cancel the whole deal and keep the deposit.</w:t>
+        <w:rPr>
+          <w:b/>
+          <w:sz w:val="28"/>
+        </w:rPr>
+        <w:t>SERVICE AGREEMENT</w:t>
+      </w:r>
+    </w:p>
+    <w:p>
+      <w:pPr>
+        <w:spacing w:after="120"/>
+      </w:pPr>
+      <w:r>
+        <w:rPr>
+          <w:b w:val="0"/>
+          <w:sz w:val="22"/>
+        </w:rPr>
+        <w:t>Between: PT Maju Bersama (us, the Company) and Mr. Budi Santoso (Client)</w:t>
+      </w:r>
+    </w:p>
+    <w:p>
+      <w:pPr>
+        <w:spacing w:after="240"/>
+      </w:pPr>
+      <w:r>
+        <w:rPr>
+          <w:b w:val="0"/>
+          <w:sz w:val="22"/>
+        </w:rPr>
+        <w:t>Date: January 15, 2026</w:t>
+      </w:r>
+    </w:p>
+    <w:p>
+      <w:pPr>
+        <w:spacing w:after="120"/>
+      </w:pPr>
+      <w:r>
+        <w:rPr>
+          <w:b/>
+          <w:sz w:val="22"/>
+        </w:rPr>
+        <w:t>1. WHAT THIS AGREEMENT IS ABOUT</w:t>
+      </w:r>
+    </w:p>
+    <w:p>
+      <w:pPr>
+        <w:spacing w:after="120"/>
+      </w:pPr>
+      <w:r>
+        <w:rPr>
+          <w:b w:val="0"/>
+          <w:sz w:val="22"/>
+        </w:rPr>
+        <w:t>This agreement is basically about the consulting services that we're going to provide to the Client. We'll be helping with legal compliance stuff and regulatory advisory for the Client's business operations in Indonesia. The scope covers general legal consultation, contract drafting assistance, regulatory filing support, and compliance monitoring. If the Client needs extra services that aren't listed here, we can discuss and add them later with a separate addendum.</w:t>
+      </w:r>
+    </w:p>
+    <w:p>
+      <w:pPr>
+        <w:spacing w:after="120"/>
+      </w:pPr>
+      <w:r>
+        <w:rPr>
+          <w:b/>
+          <w:sz w:val="22"/>
+        </w:rPr>
+        <w:t>2. HOW LONG THIS LASTS</w:t>
+      </w:r>
+    </w:p>
+    <w:p>
+      <w:pPr>
+        <w:spacing w:after="120"/>
+      </w:pPr>
+      <w:r>
+        <w:rPr>
+          <w:b w:val="0"/>
+          <w:sz w:val="22"/>
+        </w:rPr>
+        <w:t>This agreement starts on February 1, 2026 and goes for 12 months until January 31, 2027. If both sides are happy, we can renew it for another year by just agreeing in writing at least 30 days before it ends. Either party can end this agreement early by giving 60 days written notice to the other side. If someone terminates early, any fees already paid for services not yet delivered will be refunded on a pro-rata basis within 30 business days.</w:t>
+      </w:r>
+    </w:p>
+    <w:p>
+      <w:pPr>
+        <w:spacing w:after="120"/>
+      </w:pPr>
+      <w:r>
+        <w:rPr>
+          <w:b/>
+          <w:sz w:val="22"/>
+        </w:rPr>
+        <w:t>3. PAYMENT TERMS</w:t>
+      </w:r>
+    </w:p>
+    <w:p>
+      <w:pPr>
+        <w:spacing w:after="120"/>
+      </w:pPr>
+      <w:r>
+        <w:rPr>
+          <w:b w:val="0"/>
+          <w:sz w:val="22"/>
+        </w:rPr>
+        <w:t>The Client will pay us IDR 50,000,000 per month for the services described above. Payment is due within 14 days after we send the invoice at the beginning of each month. If the Client doesn't pay on time, we'll charge a late fee of 1.5% per month on the outstanding amount. All payments should be made by bank transfer to our designated account. We reserve the right to pause our services if payment is overdue by more than 30 days.</w:t>
+      </w:r>
+    </w:p>
+    <w:p>
+      <w:pPr>
+        <w:spacing w:after="120"/>
+      </w:pPr>
+      <w:r>
+        <w:rPr>
+          <w:b/>
+          <w:sz w:val="22"/>
+        </w:rPr>
+        <w:t>4. WHAT WE PROMISE TO DO</w:t>
+      </w:r>
+    </w:p>
+    <w:p>
+      <w:pPr>
+        <w:spacing w:after="120"/>
+      </w:pPr>
+      <w:r>
+        <w:rPr>
+          <w:b w:val="0"/>
+          <w:sz w:val="22"/>
+        </w:rPr>
+        <w:t>We promise to do our best to provide quality consulting services in line with professional standards. Our team will assign at least one senior consultant to handle the Client's account. We will respond to the Client's inquiries within 2 business days under normal circumstances. For urgent matters that affect the Client's legal standing, we will try to respond within 24 hours. We'll provide monthly summary reports of all activities and advice given during that period.</w:t>
+      </w:r>
+    </w:p>
+    <w:p>
+      <w:pPr>
+        <w:spacing w:after="120"/>
+      </w:pPr>
+      <w:r>
+        <w:rPr>
+          <w:b/>
+          <w:sz w:val="22"/>
+        </w:rPr>
+        <w:t>5. CONFIDENTIALITY</w:t>
+      </w:r>
+    </w:p>
+    <w:p>
+      <w:pPr>
+        <w:spacing w:after="120"/>
+      </w:pPr>
+      <w:r>
+        <w:rPr>
+          <w:b w:val="0"/>
+          <w:sz w:val="22"/>
+        </w:rPr>
+        <w:t>Both sides agree to keep each other's confidential information secret and not share it with anyone else. This means all business information, financial data, trade secrets, client lists, and any documents shared during the engagement. This confidentiality obligation will continue for 3 years even after this agreement ends. If someone needs to disclose confidential info because of a court order or law, they need to tell the other party first whenever possible.</w:t>
       </w:r>
     </w:p>
     <w:p>
       <w:r>
-        <w:t>Both sides agree to sort out any disagreements by talking it over before going to court or anything like that.</w:t>
+        <w:br w:type="page"/>
+      </w:r>
+    </w:p>
+    <w:p>
+      <w:pPr>
+        <w:spacing w:after="120"/>
+      </w:pPr>
+      <w:r>
+        <w:rPr>
+          <w:b/>
+          <w:sz w:val="22"/>
+        </w:rPr>
+        <w:t>6. WHO OWNS THE WORK</w:t>
+      </w:r>
+    </w:p>
+    <w:p>
+      <w:pPr>
+        <w:spacing w:after="120"/>
+      </w:pPr>
+      <w:r>
+        <w:rPr>
+          <w:b w:val="0"/>
+          <w:sz w:val="22"/>
+        </w:rPr>
+        <w:t>All the work product and deliverables we create for the Client during this engagement will belong to the Client. This includes legal opinions, drafted contracts, compliance reports, and any advisory documents. However, our general know-how, methodologies, and tools that we developed independently remain our property. We can use general knowledge gained during this engagement for other clients as long as no confidential information is disclosed.</w:t>
+      </w:r>
+    </w:p>
+    <w:p>
+      <w:pPr>
+        <w:spacing w:after="120"/>
+      </w:pPr>
+      <w:r>
+        <w:rPr>
+          <w:b/>
+          <w:sz w:val="22"/>
+        </w:rPr>
+        <w:t>7. LIABILITY AND INDEMNIFICATION</w:t>
+      </w:r>
+    </w:p>
+    <w:p>
+      <w:pPr>
+        <w:spacing w:after="120"/>
+      </w:pPr>
+      <w:r>
+        <w:rPr>
+          <w:b w:val="0"/>
+          <w:sz w:val="22"/>
+        </w:rPr>
+        <w:t>Our total liability under this agreement won't exceed the total fees paid by the Client in the last 6 months. We're not responsible for any indirect damages, lost profits, or consequential losses even if we were told they might happen. The Client agrees to indemnify us against any claims from third parties that arise from the Client's use of our advice in ways we didn't recommend. Neither party will be held responsible for delays or failures caused by events beyond their reasonable control like natural disasters, government actions, or pandemics.</w:t>
+      </w:r>
+    </w:p>
+    <w:p>
+      <w:pPr>
+        <w:spacing w:after="120"/>
+      </w:pPr>
+      <w:r>
+        <w:rPr>
+          <w:b/>
+          <w:sz w:val="22"/>
+        </w:rPr>
+        <w:t>8. DISPUTE RESOLUTION</w:t>
+      </w:r>
+    </w:p>
+    <w:p>
+      <w:pPr>
+        <w:spacing w:after="120"/>
+      </w:pPr>
+      <w:r>
+        <w:rPr>
+          <w:b w:val="0"/>
+          <w:sz w:val="22"/>
+        </w:rPr>
+        <w:t>If there's a disagreement between us, we'll first try to sort it out through friendly discussion within 30 days. If that doesn't work, we agree to go to mediation using a mediator that both sides can agree on. If mediation also fails after 60 days, then either party can take the matter to the District Court of Central Jakarta. This agreement is governed by the laws of the Republic of Indonesia.</w:t>
+      </w:r>
+    </w:p>
+    <w:p>
+      <w:pPr>
+        <w:spacing w:after="120"/>
+      </w:pPr>
+      <w:r>
+        <w:rPr>
+          <w:b/>
+          <w:sz w:val="22"/>
+        </w:rPr>
+        <w:t>9. GENERAL STUFF</w:t>
+      </w:r>
+    </w:p>
+    <w:p>
+      <w:pPr>
+        <w:spacing w:after="120"/>
+      </w:pPr>
+      <w:r>
+        <w:rPr>
+          <w:b w:val="0"/>
+          <w:sz w:val="22"/>
+        </w:rPr>
+        <w:t>This agreement is the entire deal between us and replaces any previous discussions or agreements about the same subject. Any changes to this agreement need to be in writing and signed by both parties to be valid. If any part of this agreement turns out to be unenforceable, the rest of it still stands. Neither side can transfer their rights or obligations under this agreement without the other's written consent. This agreement can be signed in multiple copies and each one counts as an original.</w:t>
+      </w:r>
+    </w:p>
+    <w:p>
+      <w:pPr>
+        <w:spacing w:after="400"/>
+      </w:pPr>
+      <w:r>
+        <w:rPr>
+          <w:b/>
+          <w:sz w:val="22"/>
+        </w:rPr>
+        <w:t>SIGNATURES</w:t>
+      </w:r>
+    </w:p>
+    <w:p>
+      <w:pPr>
+        <w:spacing w:after="120"/>
+      </w:pPr>
+      <w:r>
+        <w:rPr>
+          <w:b w:val="0"/>
+          <w:sz w:val="22"/>
+        </w:rPr>
+        <w:t>For PT Maju Bersama: ___________________     Date: ___________</w:t>
+      </w:r>
+    </w:p>
+    <w:p>
+      <w:pPr>
+        <w:spacing w:after="120"/>
+      </w:pPr>
+      <w:r>
+        <w:rPr>
+          <w:b w:val="0"/>
+          <w:sz w:val="22"/>
+        </w:rPr>
+        <w:t>For Mr. Budi Santoso: ___________________    Date: ___________</w:t>
       </w:r>
     </w:p>
     <w:sectPr>
-      <w:pgSz w:w="12240" w:h="15840"/>
-      <w:pgMar w:top="1440" w:right="1800" w:bottom="1440" w:left="1800" w:header="720" w:footer="720" w:gutter="0"/>
+      <w:pgSz w:w="11909" w:h="16834"/>
+      <w:pgMar w:top="1440" w:right="1440" w:bottom="1440" w:left="1440" w:header="720" w:footer="720" w:gutter="0"/>
       <w:cols w:space="720"/>
       <w:docGrid w:linePitch="360"/>
     </w:sectPr>

</xml_diff>